<commit_message>
Tax Court pretrial memorandum: docx/build-reference.sh and reference.docx give way to docx/reference.xml (fb docx-reference --extract, styles verbatim), the face {font}: Liberation Serif, the typst face, instead of the builder's EB Garamond (DEF-FONT-002 failed on both samples, now passes); not a byte-identical port, every page of both samples reviewed against typst; check.sh typst 0 failed, docx 0 failed (was 2), XENG-001 pass on both samples (XENG-002/003 reported, not gated) (fb-595.68.5)
</commit_message>
<xml_diff>
--- a/courts/national/tax-court/pretrial-memorandum/usage/OUTPUT-pretrial-memorandum-2.docx
+++ b/courts/national/tax-court/pretrial-memorandum/usage/OUTPUT-pretrial-memorandum-2.docx
@@ -1011,14 +1011,15 @@
         <w:t xml:space="preserve"> In Progress</w:t>
       </w:r>
     </w:p>
-    <w:bookmarkStart w:id="20" w:name="motions-you-expect-to-make"/>
     <w:p>
       <w:pPr>
         <w:pStyle w:val="Heading1"/>
       </w:pPr>
+      <w:bookmarkStart w:id="9" w:name="_073ef12fd910fedf113104e7ac917a4a67f751b"/>
       <w:r>
         <w:t xml:space="preserve">MOTIONS YOU EXPECT TO MAKE</w:t>
       </w:r>
+      <w:bookmarkEnd w:id="9"/>
     </w:p>
     <w:p>
       <w:pPr>
@@ -1036,15 +1037,15 @@
         <w:t xml:space="preserve">Petitioners do not expect to move to dismiss or for summary judgment.</w:t>
       </w:r>
     </w:p>
-    <w:bookmarkEnd w:id="20"/>
-    <w:bookmarkStart w:id="21" w:name="issues"/>
     <w:p>
       <w:pPr>
         <w:pStyle w:val="Heading1"/>
       </w:pPr>
+      <w:bookmarkStart w:id="10" w:name="_issues"/>
       <w:r>
         <w:t xml:space="preserve">ISSUES</w:t>
       </w:r>
+      <w:bookmarkEnd w:id="10"/>
     </w:p>
     <w:p>
       <w:pPr>
@@ -1070,15 +1071,15 @@
         <w:t xml:space="preserve">3. Whether petitioners had reasonable cause and acted in good faith under section 6664(c), so that the accuracy-related penalty under section 6662(a) does not apply.</w:t>
       </w:r>
     </w:p>
-    <w:bookmarkEnd w:id="21"/>
-    <w:bookmarkStart w:id="22" w:name="witnesses-you-expect-to-call"/>
     <w:p>
       <w:pPr>
         <w:pStyle w:val="Heading1"/>
       </w:pPr>
+      <w:bookmarkStart w:id="11" w:name="_7da629a1aef9a3866012c4d4009154ba981d63a"/>
       <w:r>
         <w:t xml:space="preserve">WITNESSES YOU EXPECT TO CALL</w:t>
       </w:r>
+      <w:bookmarkEnd w:id="11"/>
     </w:p>
     <w:tbl>
       <w:tblPr>
@@ -1191,15 +1192,15 @@
         </w:tc>
       </w:tr>
     </w:tbl>
-    <w:bookmarkEnd w:id="22"/>
-    <w:bookmarkStart w:id="23" w:name="summary-of-facts"/>
     <w:p>
       <w:pPr>
         <w:pStyle w:val="Heading1"/>
       </w:pPr>
+      <w:bookmarkStart w:id="12" w:name="_85f3cf5f93909852a209baf4fcf703e4ef0c042"/>
       <w:r>
         <w:t xml:space="preserve">SUMMARY OF FACTS</w:t>
       </w:r>
+      <w:bookmarkEnd w:id="12"/>
     </w:p>
     <w:p>
       <w:pPr>
@@ -1365,14 +1366,13 @@
         </w:tc>
       </w:tr>
     </w:tbl>
-    <w:bookmarkEnd w:id="23"/>
     <w:sectPr>
-      <w:footerReference r:id="rId9" w:type="default"/>
+      <w:footerReference w:type="default" r:id="rIdFooter1"/>
       <w:footnotePr>
         <w:numRestart w:val="eachSect"/>
       </w:footnotePr>
-      <w:pgSz w:h="15840" w:w="12240"/>
-      <w:pgMar w:bottom="1440" w:footer="1080" w:gutter="0" w:header="720" w:left="1440" w:right="1440" w:top="1440"/>
+      <w:pgSz w:w="12240" w:h="15840"/>
+      <w:pgMar w:top="1440" w:right="1440" w:bottom="1440" w:left="1440" w:header="720" w:footer="1080" w:gutter="0"/>
     </w:sectPr>
   </w:body>
 </w:document>
@@ -1517,20 +1517,20 @@
   <w:docDefaults>
     <w:rPrDefault>
       <w:rPr>
-        <w:rFonts w:ascii="EB Garamond" w:cs="EB Garamond" w:eastAsia="EB Garamond" w:hAnsi="EB Garamond"/>
+        <w:rFonts w:ascii="Liberation Serif" w:hAnsi="Liberation Serif" w:eastAsia="Liberation Serif" w:cs="Liberation Serif"/>
         <w:sz w:val="28"/>
         <w:szCs w:val="28"/>
-        <w:lang w:bidi="ar-SA" w:eastAsia="en-US" w:val="en-US"/>
+        <w:lang w:val="en-US" w:eastAsia="en-US" w:bidi="ar-SA"/>
       </w:rPr>
     </w:rPrDefault>
     <w:pPrDefault>
       <w:pPr>
-        <w:spacing w:after="0" w:before="0" w:line="240" w:lineRule="auto"/>
+        <w:spacing w:before="0" w:after="0" w:line="240" w:lineRule="auto"/>
       </w:pPr>
     </w:pPrDefault>
   </w:docDefaults>
-  <w:latentStyles w:count="276" w:defLockedState="0" w:defQFormat="0" w:defSemiHidden="0" w:defUIPriority="0" w:defUnhideWhenUsed="0"/>
-  <w:style w:styleId="Title" w:type="paragraph">
+  <w:latentStyles w:defLockedState="0" w:defUIPriority="0" w:defSemiHidden="0" w:defUnhideWhenUsed="0" w:defQFormat="0" w:count="276"/>
+  <w:style w:type="paragraph" w:styleId="Title">
     <w:name w:val="Title"/>
     <w:basedOn w:val="Normal"/>
     <w:next w:val="BodyText"/>
@@ -1544,24 +1544,24 @@
       <w:jc w:val="center"/>
     </w:pPr>
     <w:rPr>
-      <w:rFonts w:ascii="EB Garamond" w:cs="EB Garamond" w:eastAsia="EB Garamond" w:hAnsi="EB Garamond"/>
+      <w:rFonts w:ascii="Liberation Serif" w:hAnsi="Liberation Serif" w:eastAsia="Liberation Serif" w:cs="Liberation Serif"/>
       <w:sz w:val="56"/>
       <w:szCs w:val="56"/>
     </w:rPr>
   </w:style>
-  <w:style w:customStyle="1" w:styleId="TitleChar" w:type="character">
+  <w:style w:type="character" w:customStyle="1" w:styleId="TitleChar">
     <w:name w:val="Title Char"/>
     <w:basedOn w:val="DefaultParagraphFont"/>
     <w:link w:val="Title"/>
     <w:uiPriority w:val="10"/>
     <w:rsid w:val="00A10FD9"/>
     <w:rPr>
-      <w:rFonts w:ascii="EB Garamond" w:cs="EB Garamond" w:eastAsia="EB Garamond" w:hAnsi="EB Garamond"/>
+      <w:rFonts w:ascii="Liberation Serif" w:hAnsi="Liberation Serif" w:eastAsia="Liberation Serif" w:cs="Liberation Serif"/>
       <w:sz w:val="56"/>
       <w:szCs w:val="56"/>
     </w:rPr>
   </w:style>
-  <w:style w:styleId="Subtitle" w:type="paragraph">
+  <w:style w:type="paragraph" w:styleId="Subtitle">
     <w:name w:val="Subtitle"/>
     <w:basedOn w:val="Title"/>
     <w:next w:val="BodyText"/>
@@ -1575,27 +1575,27 @@
       </w:numPr>
     </w:pPr>
     <w:rPr>
-      <w:rFonts w:ascii="EB Garamond" w:cs="EB Garamond" w:eastAsia="EB Garamond" w:hAnsi="EB Garamond"/>
+      <w:rFonts w:ascii="Liberation Serif" w:hAnsi="Liberation Serif" w:eastAsia="Liberation Serif" w:cs="Liberation Serif"/>
       <w:spacing w:val="15"/>
       <w:sz w:val="28"/>
       <w:szCs w:val="28"/>
     </w:rPr>
   </w:style>
-  <w:style w:customStyle="1" w:styleId="SubtitleChar" w:type="character">
+  <w:style w:type="character" w:customStyle="1" w:styleId="SubtitleChar">
     <w:name w:val="Subtitle Char"/>
     <w:basedOn w:val="DefaultParagraphFont"/>
     <w:link w:val="Subtitle"/>
     <w:uiPriority w:val="11"/>
     <w:rsid w:val="00A10FD9"/>
     <w:rPr>
-      <w:rFonts w:ascii="EB Garamond" w:cs="EB Garamond" w:eastAsia="EB Garamond" w:hAnsi="EB Garamond"/>
-      <w:color w:themeColor="text1" w:themeTint="A6" w:val="595959"/>
+      <w:rFonts w:ascii="Liberation Serif" w:hAnsi="Liberation Serif" w:eastAsia="Liberation Serif" w:cs="Liberation Serif"/>
+      <w:color w:val="595959" w:themeColor="text1" w:themeTint="A6"/>
       <w:spacing w:val="15"/>
       <w:sz w:val="28"/>
       <w:szCs w:val="28"/>
     </w:rPr>
   </w:style>
-  <w:style w:customStyle="1" w:styleId="Author" w:type="paragraph">
+  <w:style w:type="paragraph" w:customStyle="1" w:styleId="Author">
     <w:name w:val="Author"/>
     <w:basedOn w:val="Title"/>
     <w:next w:val="BodyText"/>
@@ -1609,7 +1609,7 @@
       <w:szCs w:val="24"/>
     </w:rPr>
   </w:style>
-  <w:style w:styleId="Date" w:type="paragraph">
+  <w:style w:type="paragraph" w:styleId="Date">
     <w:name w:val="Date"/>
     <w:basedOn w:val="Title"/>
     <w:next w:val="BodyText"/>
@@ -1623,7 +1623,7 @@
       <w:szCs w:val="24"/>
     </w:rPr>
   </w:style>
-  <w:style w:customStyle="1" w:styleId="AbstractTitle" w:type="paragraph">
+  <w:style w:type="paragraph" w:customStyle="1" w:styleId="AbstractTitle">
     <w:name w:val="Abstract Title"/>
     <w:basedOn w:val="Normal"/>
     <w:next w:val="Abstract"/>
@@ -1631,7 +1631,7 @@
     <w:pPr>
       <w:keepNext/>
       <w:keepLines/>
-      <w:spacing w:after="0" w:before="300"/>
+      <w:spacing w:before="300" w:after="0"/>
       <w:jc w:val="center"/>
     </w:pPr>
     <w:rPr>
@@ -1640,7 +1640,7 @@
       <w:szCs w:val="20"/>
     </w:rPr>
   </w:style>
-  <w:style w:customStyle="1" w:styleId="Abstract" w:type="paragraph">
+  <w:style w:type="paragraph" w:customStyle="1" w:styleId="Abstract">
     <w:name w:val="Abstract"/>
     <w:basedOn w:val="Normal"/>
     <w:next w:val="BodyText"/>
@@ -1648,14 +1648,14 @@
     <w:pPr>
       <w:keepNext/>
       <w:keepLines/>
-      <w:spacing w:after="300" w:before="100"/>
+      <w:spacing w:before="100" w:after="300"/>
     </w:pPr>
     <w:rPr>
       <w:sz w:val="20"/>
       <w:szCs w:val="20"/>
     </w:rPr>
   </w:style>
-  <w:style w:styleId="Bibliography" w:type="paragraph">
+  <w:style w:type="paragraph" w:styleId="Bibliography">
     <w:name w:val="Bibliography"/>
     <w:basedOn w:val="Normal"/>
     <w:next w:val="Bibliography"/>
@@ -1663,7 +1663,7 @@
     <w:pPr/>
     <w:rPr/>
   </w:style>
-  <w:style w:styleId="Heading4" w:type="paragraph">
+  <w:style w:type="paragraph" w:styleId="Heading4">
     <w:name w:val="heading 4"/>
     <w:basedOn w:val="Normal"/>
     <w:next w:val="BodyText"/>
@@ -1676,17 +1676,17 @@
     <w:pPr>
       <w:keepNext/>
       <w:keepLines/>
-      <w:spacing w:after="40" w:before="80"/>
+      <w:spacing w:before="80" w:after="40"/>
       <w:outlineLvl w:val="3"/>
     </w:pPr>
     <w:rPr>
-      <w:rFonts w:ascii="EB Garamond" w:cs="EB Garamond" w:eastAsia="EB Garamond" w:hAnsi="EB Garamond"/>
+      <w:rFonts w:ascii="Liberation Serif" w:hAnsi="Liberation Serif" w:eastAsia="Liberation Serif" w:cs="Liberation Serif"/>
       <w:i/>
       <w:iCs/>
-      <w:color w:themeColor="accent1" w:themeShade="BF" w:val="0F4761"/>
-    </w:rPr>
-  </w:style>
-  <w:style w:styleId="Heading5" w:type="paragraph">
+      <w:color w:val="0F4761" w:themeColor="accent1" w:themeShade="BF"/>
+    </w:rPr>
+  </w:style>
+  <w:style w:type="paragraph" w:styleId="Heading5">
     <w:name w:val="heading 5"/>
     <w:basedOn w:val="Normal"/>
     <w:next w:val="BodyText"/>
@@ -1699,15 +1699,15 @@
     <w:pPr>
       <w:keepNext/>
       <w:keepLines/>
-      <w:spacing w:after="40" w:before="80"/>
+      <w:spacing w:before="80" w:after="40"/>
       <w:outlineLvl w:val="4"/>
     </w:pPr>
     <w:rPr>
-      <w:rFonts w:ascii="EB Garamond" w:cs="EB Garamond" w:eastAsia="EB Garamond" w:hAnsi="EB Garamond"/>
-      <w:color w:themeColor="accent1" w:themeShade="BF" w:val="0F4761"/>
-    </w:rPr>
-  </w:style>
-  <w:style w:styleId="Heading6" w:type="paragraph">
+      <w:rFonts w:ascii="Liberation Serif" w:hAnsi="Liberation Serif" w:eastAsia="Liberation Serif" w:cs="Liberation Serif"/>
+      <w:color w:val="0F4761" w:themeColor="accent1" w:themeShade="BF"/>
+    </w:rPr>
+  </w:style>
+  <w:style w:type="paragraph" w:styleId="Heading6">
     <w:name w:val="heading 6"/>
     <w:basedOn w:val="Normal"/>
     <w:next w:val="BodyText"/>
@@ -1720,17 +1720,17 @@
     <w:pPr>
       <w:keepNext/>
       <w:keepLines/>
-      <w:spacing w:after="0" w:before="40"/>
+      <w:spacing w:before="40" w:after="0"/>
       <w:outlineLvl w:val="5"/>
     </w:pPr>
     <w:rPr>
-      <w:rFonts w:ascii="EB Garamond" w:cs="EB Garamond" w:eastAsia="EB Garamond" w:hAnsi="EB Garamond"/>
+      <w:rFonts w:ascii="Liberation Serif" w:hAnsi="Liberation Serif" w:eastAsia="Liberation Serif" w:cs="Liberation Serif"/>
       <w:i/>
       <w:iCs/>
-      <w:color w:themeColor="text1" w:themeTint="A6" w:val="595959"/>
-    </w:rPr>
-  </w:style>
-  <w:style w:styleId="Heading7" w:type="paragraph">
+      <w:color w:val="595959" w:themeColor="text1" w:themeTint="A6"/>
+    </w:rPr>
+  </w:style>
+  <w:style w:type="paragraph" w:styleId="Heading7">
     <w:name w:val="heading 7"/>
     <w:basedOn w:val="Normal"/>
     <w:next w:val="BodyText"/>
@@ -1743,15 +1743,15 @@
     <w:pPr>
       <w:keepNext/>
       <w:keepLines/>
-      <w:spacing w:after="0" w:before="40"/>
+      <w:spacing w:before="40" w:after="0"/>
       <w:outlineLvl w:val="6"/>
     </w:pPr>
     <w:rPr>
-      <w:rFonts w:ascii="EB Garamond" w:cs="EB Garamond" w:eastAsia="EB Garamond" w:hAnsi="EB Garamond"/>
-      <w:color w:themeColor="text1" w:themeTint="A6" w:val="595959"/>
-    </w:rPr>
-  </w:style>
-  <w:style w:styleId="Heading8" w:type="paragraph">
+      <w:rFonts w:ascii="Liberation Serif" w:hAnsi="Liberation Serif" w:eastAsia="Liberation Serif" w:cs="Liberation Serif"/>
+      <w:color w:val="595959" w:themeColor="text1" w:themeTint="A6"/>
+    </w:rPr>
+  </w:style>
+  <w:style w:type="paragraph" w:styleId="Heading8">
     <w:name w:val="heading 8"/>
     <w:basedOn w:val="Normal"/>
     <w:next w:val="BodyText"/>
@@ -1768,13 +1768,13 @@
       <w:outlineLvl w:val="7"/>
     </w:pPr>
     <w:rPr>
-      <w:rFonts w:ascii="EB Garamond" w:cs="EB Garamond" w:eastAsia="EB Garamond" w:hAnsi="EB Garamond"/>
+      <w:rFonts w:ascii="Liberation Serif" w:hAnsi="Liberation Serif" w:eastAsia="Liberation Serif" w:cs="Liberation Serif"/>
       <w:i/>
       <w:iCs/>
-      <w:color w:themeColor="text1" w:themeTint="D8" w:val="272727"/>
-    </w:rPr>
-  </w:style>
-  <w:style w:styleId="Heading9" w:type="paragraph">
+      <w:color w:val="272727" w:themeColor="text1" w:themeTint="D8"/>
+    </w:rPr>
+  </w:style>
+  <w:style w:type="paragraph" w:styleId="Heading9">
     <w:name w:val="heading 9"/>
     <w:basedOn w:val="Normal"/>
     <w:next w:val="BodyText"/>
@@ -1791,24 +1791,24 @@
       <w:outlineLvl w:val="8"/>
     </w:pPr>
     <w:rPr>
-      <w:rFonts w:ascii="EB Garamond" w:cs="EB Garamond" w:eastAsia="EB Garamond" w:hAnsi="EB Garamond"/>
-      <w:color w:themeColor="text1" w:themeTint="D8" w:val="272727"/>
-    </w:rPr>
-  </w:style>
-  <w:style w:customStyle="1" w:styleId="Heading1Char" w:type="character">
+      <w:rFonts w:ascii="Liberation Serif" w:hAnsi="Liberation Serif" w:eastAsia="Liberation Serif" w:cs="Liberation Serif"/>
+      <w:color w:val="272727" w:themeColor="text1" w:themeTint="D8"/>
+    </w:rPr>
+  </w:style>
+  <w:style w:type="character" w:customStyle="1" w:styleId="Heading1Char">
     <w:name w:val="Heading 1 Char"/>
     <w:basedOn w:val="DefaultParagraphFont"/>
     <w:link w:val="Heading1"/>
     <w:uiPriority w:val="9"/>
     <w:rsid w:val="00A10FD9"/>
     <w:rPr>
-      <w:rFonts w:ascii="EB Garamond" w:cs="EB Garamond" w:eastAsia="EB Garamond" w:hAnsi="EB Garamond"/>
-      <w:color w:themeColor="accent1" w:themeShade="BF" w:val="0F4761"/>
+      <w:rFonts w:ascii="Liberation Serif" w:hAnsi="Liberation Serif" w:eastAsia="Liberation Serif" w:cs="Liberation Serif"/>
+      <w:color w:val="0F4761" w:themeColor="accent1" w:themeShade="BF"/>
       <w:sz w:val="40"/>
       <w:szCs w:val="40"/>
     </w:rPr>
   </w:style>
-  <w:style w:customStyle="1" w:styleId="Heading2Char" w:type="character">
+  <w:style w:type="character" w:customStyle="1" w:styleId="Heading2Char">
     <w:name w:val="Heading 2 Char"/>
     <w:basedOn w:val="DefaultParagraphFont"/>
     <w:link w:val="Heading2"/>
@@ -1816,13 +1816,13 @@
     <w:semiHidden/>
     <w:rsid w:val="00A10FD9"/>
     <w:rPr>
-      <w:rFonts w:ascii="EB Garamond" w:cs="EB Garamond" w:eastAsia="EB Garamond" w:hAnsi="EB Garamond"/>
-      <w:color w:themeColor="accent1" w:themeShade="BF" w:val="0F4761"/>
+      <w:rFonts w:ascii="Liberation Serif" w:hAnsi="Liberation Serif" w:eastAsia="Liberation Serif" w:cs="Liberation Serif"/>
+      <w:color w:val="0F4761" w:themeColor="accent1" w:themeShade="BF"/>
       <w:sz w:val="32"/>
       <w:szCs w:val="32"/>
     </w:rPr>
   </w:style>
-  <w:style w:customStyle="1" w:styleId="Heading3Char" w:type="character">
+  <w:style w:type="character" w:customStyle="1" w:styleId="Heading3Char">
     <w:name w:val="Heading 3 Char"/>
     <w:basedOn w:val="DefaultParagraphFont"/>
     <w:link w:val="Heading3"/>
@@ -1830,13 +1830,13 @@
     <w:semiHidden/>
     <w:rsid w:val="00A10FD9"/>
     <w:rPr>
-      <w:rFonts w:ascii="EB Garamond" w:cs="EB Garamond" w:eastAsia="EB Garamond" w:hAnsi="EB Garamond"/>
-      <w:color w:themeColor="accent1" w:themeShade="BF" w:val="0F4761"/>
+      <w:rFonts w:ascii="Liberation Serif" w:hAnsi="Liberation Serif" w:eastAsia="Liberation Serif" w:cs="Liberation Serif"/>
+      <w:color w:val="0F4761" w:themeColor="accent1" w:themeShade="BF"/>
       <w:sz w:val="28"/>
       <w:szCs w:val="28"/>
     </w:rPr>
   </w:style>
-  <w:style w:customStyle="1" w:styleId="Heading4Char" w:type="character">
+  <w:style w:type="character" w:customStyle="1" w:styleId="Heading4Char">
     <w:name w:val="Heading 4 Char"/>
     <w:basedOn w:val="DefaultParagraphFont"/>
     <w:link w:val="Heading4"/>
@@ -1844,13 +1844,13 @@
     <w:semiHidden/>
     <w:rsid w:val="00A10FD9"/>
     <w:rPr>
-      <w:rFonts w:ascii="EB Garamond" w:cs="EB Garamond" w:eastAsia="EB Garamond" w:hAnsi="EB Garamond"/>
+      <w:rFonts w:ascii="Liberation Serif" w:hAnsi="Liberation Serif" w:eastAsia="Liberation Serif" w:cs="Liberation Serif"/>
       <w:i/>
       <w:iCs/>
-      <w:color w:themeColor="accent1" w:themeShade="BF" w:val="0F4761"/>
-    </w:rPr>
-  </w:style>
-  <w:style w:customStyle="1" w:styleId="Heading5Char" w:type="character">
+      <w:color w:val="0F4761" w:themeColor="accent1" w:themeShade="BF"/>
+    </w:rPr>
+  </w:style>
+  <w:style w:type="character" w:customStyle="1" w:styleId="Heading5Char">
     <w:name w:val="Heading 5 Char"/>
     <w:basedOn w:val="DefaultParagraphFont"/>
     <w:link w:val="Heading5"/>
@@ -1858,11 +1858,11 @@
     <w:semiHidden/>
     <w:rsid w:val="00A10FD9"/>
     <w:rPr>
-      <w:rFonts w:ascii="EB Garamond" w:cs="EB Garamond" w:eastAsia="EB Garamond" w:hAnsi="EB Garamond"/>
-      <w:color w:themeColor="accent1" w:themeShade="BF" w:val="0F4761"/>
-    </w:rPr>
-  </w:style>
-  <w:style w:customStyle="1" w:styleId="Heading6Char" w:type="character">
+      <w:rFonts w:ascii="Liberation Serif" w:hAnsi="Liberation Serif" w:eastAsia="Liberation Serif" w:cs="Liberation Serif"/>
+      <w:color w:val="0F4761" w:themeColor="accent1" w:themeShade="BF"/>
+    </w:rPr>
+  </w:style>
+  <w:style w:type="character" w:customStyle="1" w:styleId="Heading6Char">
     <w:name w:val="Heading 6 Char"/>
     <w:basedOn w:val="DefaultParagraphFont"/>
     <w:link w:val="Heading6"/>
@@ -1870,13 +1870,13 @@
     <w:semiHidden/>
     <w:rsid w:val="00A10FD9"/>
     <w:rPr>
-      <w:rFonts w:ascii="EB Garamond" w:cs="EB Garamond" w:eastAsia="EB Garamond" w:hAnsi="EB Garamond"/>
+      <w:rFonts w:ascii="Liberation Serif" w:hAnsi="Liberation Serif" w:eastAsia="Liberation Serif" w:cs="Liberation Serif"/>
       <w:i/>
       <w:iCs/>
-      <w:color w:themeColor="text1" w:themeTint="A6" w:val="595959"/>
-    </w:rPr>
-  </w:style>
-  <w:style w:customStyle="1" w:styleId="Heading7Char" w:type="character">
+      <w:color w:val="595959" w:themeColor="text1" w:themeTint="A6"/>
+    </w:rPr>
+  </w:style>
+  <w:style w:type="character" w:customStyle="1" w:styleId="Heading7Char">
     <w:name w:val="Heading 7 Char"/>
     <w:basedOn w:val="DefaultParagraphFont"/>
     <w:link w:val="Heading7"/>
@@ -1884,11 +1884,11 @@
     <w:semiHidden/>
     <w:rsid w:val="00A10FD9"/>
     <w:rPr>
-      <w:rFonts w:ascii="EB Garamond" w:cs="EB Garamond" w:eastAsia="EB Garamond" w:hAnsi="EB Garamond"/>
-      <w:color w:themeColor="text1" w:themeTint="A6" w:val="595959"/>
-    </w:rPr>
-  </w:style>
-  <w:style w:customStyle="1" w:styleId="Heading8Char" w:type="character">
+      <w:rFonts w:ascii="Liberation Serif" w:hAnsi="Liberation Serif" w:eastAsia="Liberation Serif" w:cs="Liberation Serif"/>
+      <w:color w:val="595959" w:themeColor="text1" w:themeTint="A6"/>
+    </w:rPr>
+  </w:style>
+  <w:style w:type="character" w:customStyle="1" w:styleId="Heading8Char">
     <w:name w:val="Heading 8 Char"/>
     <w:basedOn w:val="DefaultParagraphFont"/>
     <w:link w:val="Heading8"/>
@@ -1896,13 +1896,13 @@
     <w:semiHidden/>
     <w:rsid w:val="00A10FD9"/>
     <w:rPr>
-      <w:rFonts w:ascii="EB Garamond" w:cs="EB Garamond" w:eastAsia="EB Garamond" w:hAnsi="EB Garamond"/>
+      <w:rFonts w:ascii="Liberation Serif" w:hAnsi="Liberation Serif" w:eastAsia="Liberation Serif" w:cs="Liberation Serif"/>
       <w:i/>
       <w:iCs/>
-      <w:color w:themeColor="text1" w:themeTint="D8" w:val="272727"/>
-    </w:rPr>
-  </w:style>
-  <w:style w:customStyle="1" w:styleId="Heading9Char" w:type="character">
+      <w:color w:val="272727" w:themeColor="text1" w:themeTint="D8"/>
+    </w:rPr>
+  </w:style>
+  <w:style w:type="character" w:customStyle="1" w:styleId="Heading9Char">
     <w:name w:val="Heading 9 Char"/>
     <w:basedOn w:val="DefaultParagraphFont"/>
     <w:link w:val="Heading9"/>
@@ -1910,11 +1910,11 @@
     <w:semiHidden/>
     <w:rsid w:val="00A10FD9"/>
     <w:rPr>
-      <w:rFonts w:ascii="EB Garamond" w:cs="EB Garamond" w:eastAsia="EB Garamond" w:hAnsi="EB Garamond"/>
-      <w:color w:themeColor="text1" w:themeTint="D8" w:val="272727"/>
-    </w:rPr>
-  </w:style>
-  <w:style w:styleId="FootnoteBlockText" w:type="paragraph">
+      <w:rFonts w:ascii="Liberation Serif" w:hAnsi="Liberation Serif" w:eastAsia="Liberation Serif" w:cs="Liberation Serif"/>
+      <w:color w:val="272727" w:themeColor="text1" w:themeTint="D8"/>
+    </w:rPr>
+  </w:style>
+  <w:style w:type="paragraph" w:styleId="FootnoteBlockText">
     <w:name w:val="Footnote Block Text"/>
     <w:basedOn w:val="FootnoteText"/>
     <w:next w:val="FootnoteText"/>
@@ -1922,16 +1922,16 @@
     <w:unhideWhenUsed/>
     <w:qFormat/>
     <w:pPr>
-      <w:spacing w:after="100" w:before="100"/>
+      <w:spacing w:before="100" w:after="100"/>
       <w:ind w:firstLine="0" w:left="480" w:right="480"/>
     </w:pPr>
   </w:style>
-  <w:style w:default="1" w:styleId="DefaultParagraphFont" w:type="character">
+  <w:style w:type="character" w:default="1" w:styleId="DefaultParagraphFont">
     <w:name w:val="Default Paragraph Font"/>
     <w:semiHidden/>
     <w:unhideWhenUsed/>
   </w:style>
-  <w:style w:customStyle="1" w:styleId="DefinitionTerm" w:type="paragraph">
+  <w:style w:type="paragraph" w:customStyle="1" w:styleId="DefinitionTerm">
     <w:name w:val="Definition Term"/>
     <w:basedOn w:val="Normal"/>
     <w:next w:val="Definition"/>
@@ -1944,75 +1944,75 @@
       <w:b/>
     </w:rPr>
   </w:style>
-  <w:style w:customStyle="1" w:styleId="Definition" w:type="paragraph">
+  <w:style w:type="paragraph" w:customStyle="1" w:styleId="Definition">
     <w:name w:val="Definition"/>
     <w:basedOn w:val="Normal"/>
   </w:style>
-  <w:style w:styleId="Caption" w:type="paragraph">
+  <w:style w:type="paragraph" w:styleId="Caption">
     <w:name w:val="Caption"/>
     <w:basedOn w:val="Normal"/>
     <w:link w:val="BodyTextChar"/>
     <w:pPr>
-      <w:spacing w:after="120" w:before="0"/>
+      <w:spacing w:before="0" w:after="120"/>
     </w:pPr>
     <w:rPr>
       <w:i/>
     </w:rPr>
   </w:style>
-  <w:style w:customStyle="1" w:styleId="TableCaption" w:type="paragraph">
+  <w:style w:type="paragraph" w:customStyle="1" w:styleId="TableCaption">
     <w:name w:val="Table Caption"/>
     <w:basedOn w:val="Caption"/>
     <w:pPr>
       <w:keepNext/>
     </w:pPr>
   </w:style>
-  <w:style w:customStyle="1" w:styleId="ImageCaption" w:type="paragraph">
+  <w:style w:type="paragraph" w:customStyle="1" w:styleId="ImageCaption">
     <w:name w:val="Image Caption"/>
     <w:basedOn w:val="Caption"/>
   </w:style>
-  <w:style w:customStyle="1" w:styleId="Figure" w:type="paragraph">
+  <w:style w:type="paragraph" w:customStyle="1" w:styleId="Figure">
     <w:name w:val="Figure"/>
     <w:basedOn w:val="Normal"/>
   </w:style>
-  <w:style w:customStyle="1" w:styleId="CaptionedFigure" w:type="paragraph">
+  <w:style w:type="paragraph" w:customStyle="1" w:styleId="CaptionedFigure">
     <w:name w:val="Captioned Figure"/>
     <w:basedOn w:val="Figure"/>
     <w:pPr>
       <w:keepNext/>
     </w:pPr>
   </w:style>
-  <w:style w:customStyle="1" w:styleId="BodyTextChar" w:type="character">
+  <w:style w:type="character" w:customStyle="1" w:styleId="BodyTextChar">
     <w:name w:val="Body Text Char"/>
     <w:basedOn w:val="DefaultParagraphFont"/>
     <w:link w:val="BodyText"/>
   </w:style>
-  <w:style w:customStyle="1" w:styleId="VerbatimChar" w:type="character">
+  <w:style w:type="character" w:customStyle="1" w:styleId="VerbatimChar">
     <w:name w:val="Verbatim Char"/>
     <w:basedOn w:val="BodyTextChar"/>
     <w:rPr>
-      <w:rFonts w:ascii="EB Garamond" w:cs="EB Garamond" w:eastAsia="EB Garamond" w:hAnsi="EB Garamond"/>
+      <w:rFonts w:ascii="Liberation Serif" w:hAnsi="Liberation Serif" w:eastAsia="Liberation Serif" w:cs="Liberation Serif"/>
       <w:sz w:val="22"/>
     </w:rPr>
   </w:style>
-  <w:style w:customStyle="1" w:styleId="SectionNumber" w:type="character">
+  <w:style w:type="character" w:customStyle="1" w:styleId="SectionNumber">
     <w:name w:val="Section Number"/>
     <w:basedOn w:val="BodyTextChar"/>
   </w:style>
-  <w:style w:styleId="FootnoteReference" w:type="character">
+  <w:style w:type="character" w:styleId="FootnoteReference">
     <w:name w:val="Footnote Reference"/>
     <w:basedOn w:val="BodyTextChar"/>
     <w:rPr>
       <w:vertAlign w:val="superscript"/>
     </w:rPr>
   </w:style>
-  <w:style w:styleId="Hyperlink" w:type="character">
+  <w:style w:type="character" w:styleId="Hyperlink">
     <w:name w:val="Hyperlink"/>
     <w:basedOn w:val="BodyTextChar"/>
     <w:rPr>
-      <w:color w:themeColor="accent1" w:val="4F81BD"/>
-    </w:rPr>
-  </w:style>
-  <w:style w:styleId="TOCHeading" w:type="paragraph">
+      <w:color w:val="4F81BD" w:themeColor="accent1"/>
+    </w:rPr>
+  </w:style>
+  <w:style w:type="paragraph" w:styleId="TOCHeading">
     <w:name w:val="TOC Heading"/>
     <w:basedOn w:val="Heading1"/>
     <w:next w:val="BodyText"/>
@@ -2024,53 +2024,53 @@
       <w:outlineLvl w:val="9"/>
     </w:pPr>
     <w:rPr>
-      <w:rFonts w:ascii="EB Garamond" w:cs="EB Garamond" w:eastAsia="EB Garamond" w:hAnsi="EB Garamond"/>
+      <w:rFonts w:ascii="Liberation Serif" w:hAnsi="Liberation Serif" w:eastAsia="Liberation Serif" w:cs="Liberation Serif"/>
       <w:b w:val="0"/>
       <w:bCs w:val="0"/>
-      <w:color w:themeColor="accent1" w:themeShade="BF" w:val="365F91"/>
-    </w:rPr>
-  </w:style>
-  <w:style w:default="1" w:styleId="Normal" w:type="paragraph">
+      <w:color w:val="365F91" w:themeColor="accent1" w:themeShade="BF"/>
+    </w:rPr>
+  </w:style>
+  <w:style w:type="paragraph" w:default="1" w:styleId="Normal">
     <w:name w:val="Normal"/>
     <w:qFormat/>
     <w:pPr>
       <w:widowControl/>
-      <w:spacing w:after="0" w:before="0" w:line="240" w:lineRule="auto"/>
+      <w:spacing w:before="0" w:after="0" w:line="240" w:lineRule="auto"/>
       <w:jc w:val="left"/>
     </w:pPr>
     <w:rPr>
-      <w:rFonts w:ascii="EB Garamond" w:cs="EB Garamond" w:eastAsia="EB Garamond" w:hAnsi="EB Garamond"/>
+      <w:rFonts w:ascii="Liberation Serif" w:hAnsi="Liberation Serif" w:eastAsia="Liberation Serif" w:cs="Liberation Serif"/>
       <w:sz w:val="28"/>
       <w:szCs w:val="28"/>
     </w:rPr>
   </w:style>
-  <w:style w:styleId="BodyText" w:type="paragraph">
+  <w:style w:type="paragraph" w:styleId="BodyText">
     <w:name w:val="Body Text"/>
     <w:basedOn w:val="Normal"/>
     <w:qFormat/>
     <w:pPr>
       <w:widowControl/>
-      <w:spacing w:after="0" w:before="0" w:line="482" w:lineRule="exact"/>
+      <w:spacing w:before="0" w:after="0" w:line="482" w:lineRule="exact"/>
       <w:ind w:firstLine="720"/>
       <w:jc w:val="left"/>
     </w:pPr>
   </w:style>
-  <w:style w:customStyle="1" w:styleId="FirstParagraph" w:type="paragraph">
+  <w:style w:type="paragraph" w:customStyle="1" w:styleId="FirstParagraph">
     <w:name w:val="First Paragraph"/>
     <w:basedOn w:val="BodyText"/>
     <w:next w:val="BodyText"/>
     <w:qFormat/>
   </w:style>
-  <w:style w:customStyle="1" w:styleId="Compact" w:type="paragraph">
+  <w:style w:type="paragraph" w:customStyle="1" w:styleId="Compact">
     <w:name w:val="Compact"/>
     <w:basedOn w:val="Normal"/>
     <w:qFormat/>
     <w:pPr>
-      <w:spacing w:after="0" w:before="0" w:line="294" w:lineRule="exact"/>
-      <w:ind w:firstLine="0" w:left="0"/>
-    </w:pPr>
-  </w:style>
-  <w:style w:styleId="Heading1" w:type="paragraph">
+      <w:spacing w:before="0" w:after="0" w:line="294" w:lineRule="exact"/>
+      <w:ind w:left="0" w:firstLine="0"/>
+    </w:pPr>
+  </w:style>
+  <w:style w:type="paragraph" w:styleId="Heading1">
     <w:name w:val="heading 1"/>
     <w:basedOn w:val="Normal"/>
     <w:next w:val="BodyText"/>
@@ -2079,20 +2079,20 @@
     <w:pPr>
       <w:keepNext/>
       <w:keepLines/>
-      <w:spacing w:after="252" w:before="280" w:line="294" w:lineRule="exact"/>
+      <w:spacing w:before="280" w:after="252" w:line="294" w:lineRule="exact"/>
       <w:ind w:firstLine="0"/>
       <w:jc w:val="left"/>
       <w:outlineLvl w:val="0"/>
     </w:pPr>
     <w:rPr>
-      <w:rFonts w:ascii="EB Garamond" w:cs="EB Garamond" w:eastAsia="EB Garamond" w:hAnsi="EB Garamond"/>
+      <w:rFonts w:ascii="Liberation Serif" w:hAnsi="Liberation Serif" w:eastAsia="Liberation Serif" w:cs="Liberation Serif"/>
       <w:b/>
       <w:bCs/>
       <w:sz w:val="28"/>
       <w:szCs w:val="28"/>
     </w:rPr>
   </w:style>
-  <w:style w:styleId="Heading2" w:type="paragraph">
+  <w:style w:type="paragraph" w:styleId="Heading2">
     <w:name w:val="heading 2"/>
     <w:basedOn w:val="Heading1"/>
     <w:next w:val="BodyText"/>
@@ -2102,7 +2102,7 @@
       <w:outlineLvl w:val="1"/>
     </w:pPr>
   </w:style>
-  <w:style w:styleId="Heading3" w:type="paragraph">
+  <w:style w:type="paragraph" w:styleId="Heading3">
     <w:name w:val="heading 3"/>
     <w:basedOn w:val="Heading1"/>
     <w:next w:val="BodyText"/>
@@ -2112,63 +2112,63 @@
       <w:outlineLvl w:val="2"/>
     </w:pPr>
   </w:style>
-  <w:style w:styleId="BlockText" w:type="paragraph">
+  <w:style w:type="paragraph" w:styleId="BlockText">
     <w:name w:val="Block Text"/>
     <w:basedOn w:val="Normal"/>
     <w:next w:val="BodyText"/>
     <w:qFormat/>
     <w:pPr>
-      <w:spacing w:after="252" w:before="0" w:line="294" w:lineRule="exact"/>
-      <w:ind w:firstLine="0" w:left="720" w:right="720"/>
-    </w:pPr>
-  </w:style>
-  <w:style w:styleId="FootnoteText" w:type="paragraph">
+      <w:spacing w:before="0" w:after="252" w:line="294" w:lineRule="exact"/>
+      <w:ind w:left="720" w:right="720" w:firstLine="0"/>
+    </w:pPr>
+  </w:style>
+  <w:style w:type="paragraph" w:styleId="FootnoteText">
     <w:name w:val="footnote text"/>
     <w:basedOn w:val="Normal"/>
     <w:uiPriority w:val="99"/>
     <w:unhideWhenUsed/>
     <w:pPr>
-      <w:spacing w:after="60" w:before="0" w:line="240" w:lineRule="auto"/>
+      <w:spacing w:before="0" w:after="60" w:line="240" w:lineRule="auto"/>
       <w:ind w:firstLine="0"/>
     </w:pPr>
     <w:rPr>
-      <w:rFonts w:ascii="EB Garamond" w:cs="EB Garamond" w:eastAsia="EB Garamond" w:hAnsi="EB Garamond"/>
+      <w:rFonts w:ascii="Liberation Serif" w:hAnsi="Liberation Serif" w:eastAsia="Liberation Serif" w:cs="Liberation Serif"/>
       <w:sz w:val="28"/>
       <w:szCs w:val="28"/>
     </w:rPr>
   </w:style>
-  <w:style w:styleId="Footer" w:type="paragraph">
+  <w:style w:type="paragraph" w:styleId="Footer">
     <w:name w:val="footer"/>
     <w:basedOn w:val="Normal"/>
     <w:uiPriority w:val="99"/>
     <w:unhideWhenUsed/>
     <w:pPr>
       <w:tabs>
-        <w:tab w:pos="4680" w:val="center"/>
-        <w:tab w:pos="9360" w:val="right"/>
+        <w:tab w:val="center" w:pos="4680"/>
+        <w:tab w:val="right" w:pos="9360"/>
       </w:tabs>
-      <w:spacing w:after="0" w:before="0" w:line="240" w:lineRule="auto"/>
+      <w:spacing w:before="0" w:after="0" w:line="240" w:lineRule="auto"/>
       <w:jc w:val="center"/>
     </w:pPr>
   </w:style>
-  <w:style w:customStyle="1" w:styleId="CaptionCell" w:type="paragraph">
+  <w:style w:type="paragraph" w:customStyle="1" w:styleId="CaptionCell">
     <w:name w:val="Caption Cell"/>
     <w:basedOn w:val="Normal"/>
     <w:qFormat/>
     <w:pPr>
-      <w:spacing w:after="0" w:before="0" w:line="294" w:lineRule="exact"/>
-      <w:ind w:firstLine="0" w:left="0"/>
+      <w:spacing w:before="0" w:after="0" w:line="294" w:lineRule="exact"/>
+      <w:ind w:left="0" w:firstLine="0"/>
       <w:jc w:val="left"/>
     </w:pPr>
   </w:style>
-  <w:style w:customStyle="1" w:styleId="CourtTitle" w:type="paragraph">
+  <w:style w:type="paragraph" w:customStyle="1" w:styleId="CourtTitle">
     <w:name w:val="Court Title"/>
     <w:basedOn w:val="Normal"/>
     <w:qFormat/>
     <w:pPr>
       <w:keepNext/>
       <w:keepLines/>
-      <w:spacing w:after="0" w:before="0" w:line="294" w:lineRule="exact"/>
+      <w:spacing w:before="0" w:after="0" w:line="294" w:lineRule="exact"/>
       <w:ind w:firstLine="0"/>
       <w:jc w:val="center"/>
     </w:pPr>
@@ -2177,27 +2177,27 @@
       <w:bCs/>
     </w:rPr>
   </w:style>
-  <w:style w:default="1" w:styleId="Table" w:type="table">
+  <w:style w:type="table" w:default="1" w:styleId="Table">
     <w:name w:val="Table"/>
     <w:uiPriority w:val="59"/>
     <w:pPr>
-      <w:spacing w:after="0" w:before="0" w:line="240" w:lineRule="auto"/>
+      <w:spacing w:before="0" w:after="0" w:line="240" w:lineRule="auto"/>
     </w:pPr>
     <w:tblPr>
-      <w:tblInd w:type="dxa" w:w="0"/>
+      <w:tblInd w:w="0" w:type="dxa"/>
       <w:tblBorders>
-        <w:top w:color="000000" w:space="0" w:sz="4" w:val="single"/>
-        <w:left w:color="000000" w:space="0" w:sz="4" w:val="single"/>
-        <w:bottom w:color="000000" w:space="0" w:sz="4" w:val="single"/>
-        <w:right w:color="000000" w:space="0" w:sz="4" w:val="single"/>
-        <w:insideH w:color="000000" w:space="0" w:sz="4" w:val="single"/>
-        <w:insideV w:color="000000" w:space="0" w:sz="4" w:val="single"/>
+        <w:top w:val="single" w:sz="4" w:space="0" w:color="000000"/>
+        <w:left w:val="single" w:sz="4" w:space="0" w:color="000000"/>
+        <w:bottom w:val="single" w:sz="4" w:space="0" w:color="000000"/>
+        <w:right w:val="single" w:sz="4" w:space="0" w:color="000000"/>
+        <w:insideH w:val="single" w:sz="4" w:space="0" w:color="000000"/>
+        <w:insideV w:val="single" w:sz="4" w:space="0" w:color="000000"/>
       </w:tblBorders>
       <w:tblCellMar>
-        <w:top w:type="dxa" w:w="40"/>
-        <w:left w:type="dxa" w:w="112"/>
-        <w:bottom w:type="dxa" w:w="40"/>
-        <w:right w:type="dxa" w:w="112"/>
+        <w:top w:w="40" w:type="dxa"/>
+        <w:left w:w="112" w:type="dxa"/>
+        <w:bottom w:w="40" w:type="dxa"/>
+        <w:right w:w="112" w:type="dxa"/>
       </w:tblCellMar>
     </w:tblPr>
   </w:style>
@@ -2481,7 +2481,7 @@
     </a:clrScheme>
     <a:fontScheme name="Office">
       <a:majorFont>
-        <a:latin typeface="EB Garamond" panose="02110004020202020204"/>
+        <a:latin typeface="Liberation Serif" panose="02110004020202020204"/>
         <a:ea typeface=""/>
         <a:cs typeface=""/>
         <a:font script="Jpan" typeface="游ゴシック Light"/>
@@ -2533,7 +2533,7 @@
         <a:font script="Tfng" typeface="Ebrima"/>
       </a:majorFont>
       <a:minorFont>
-        <a:latin typeface="EB Garamond" panose="02110004020202020204"/>
+        <a:latin typeface="Liberation Serif" panose="02110004020202020204"/>
         <a:ea typeface=""/>
         <a:cs typeface=""/>
         <a:font script="Jpan" typeface="游明朝"/>

</xml_diff>